<commit_message>
TP3: Ajoute la route /health dans FastAPI
</commit_message>
<xml_diff>
--- a/TP3-api-rest.docx
+++ b/TP3-api-rest.docx
@@ -114,6 +114,184 @@
       </w:r>
       <w:r>
         <w:t>.py et main.py</w:t>
+      </w:r>
+    </w:p>
+    <w:p>
+      <w:r>
+        <w:t xml:space="preserve">Dans le fichier main.py, </w:t>
+      </w:r>
+      <w:r>
+        <w:t xml:space="preserve">on créer la première route </w:t>
+      </w:r>
+      <w:proofErr w:type="spellStart"/>
+      <w:r>
+        <w:t>health</w:t>
+      </w:r>
+      <w:proofErr w:type="spellEnd"/>
+      <w:r>
+        <w:t xml:space="preserve"> afin d’initialiser </w:t>
+      </w:r>
+      <w:proofErr w:type="spellStart"/>
+      <w:r>
+        <w:t>FastAPI</w:t>
+      </w:r>
+      <w:proofErr w:type="spellEnd"/>
+      <w:r>
+        <w:t xml:space="preserve"> et créer la route.</w:t>
+      </w:r>
+    </w:p>
+    <w:p>
+      <w:r>
+        <w:t>On lance par la suite le serveur de développement qui se recharge automatiquement (--</w:t>
+      </w:r>
+      <w:proofErr w:type="spellStart"/>
+      <w:r>
+        <w:t>reload</w:t>
+      </w:r>
+      <w:proofErr w:type="spellEnd"/>
+      <w:r>
+        <w:t xml:space="preserve">) et il </w:t>
+      </w:r>
+      <w:proofErr w:type="gramStart"/>
+      <w:r>
+        <w:t>prends</w:t>
+      </w:r>
+      <w:proofErr w:type="gramEnd"/>
+      <w:r>
+        <w:t xml:space="preserve"> en compte le fichier </w:t>
+      </w:r>
+      <w:proofErr w:type="gramStart"/>
+      <w:r>
+        <w:t>d’environnement .</w:t>
+      </w:r>
+      <w:proofErr w:type="spellStart"/>
+      <w:r>
+        <w:t>env</w:t>
+      </w:r>
+      <w:proofErr w:type="spellEnd"/>
+      <w:proofErr w:type="gramEnd"/>
+    </w:p>
+    <w:p>
+      <w:r>
+        <w:drawing>
+          <wp:inline distT="0" distB="0" distL="0" distR="0" wp14:anchorId="74C94F4B" wp14:editId="0A8BDC1E">
+            <wp:extent cx="5760720" cy="814070"/>
+            <wp:effectExtent l="0" t="0" r="0" b="5080"/>
+            <wp:docPr id="839283839" name="Image 1"/>
+            <wp:cNvGraphicFramePr>
+              <a:graphicFrameLocks xmlns:a="http://schemas.openxmlformats.org/drawingml/2006/main" noChangeAspect="1"/>
+            </wp:cNvGraphicFramePr>
+            <a:graphic xmlns:a="http://schemas.openxmlformats.org/drawingml/2006/main">
+              <a:graphicData uri="http://schemas.openxmlformats.org/drawingml/2006/picture">
+                <pic:pic xmlns:pic="http://schemas.openxmlformats.org/drawingml/2006/picture">
+                  <pic:nvPicPr>
+                    <pic:cNvPr id="839283839" name=""/>
+                    <pic:cNvPicPr/>
+                  </pic:nvPicPr>
+                  <pic:blipFill>
+                    <a:blip r:embed="rId6"/>
+                    <a:stretch>
+                      <a:fillRect/>
+                    </a:stretch>
+                  </pic:blipFill>
+                  <pic:spPr>
+                    <a:xfrm>
+                      <a:off x="0" y="0"/>
+                      <a:ext cx="5760720" cy="814070"/>
+                    </a:xfrm>
+                    <a:prstGeom prst="rect">
+                      <a:avLst/>
+                    </a:prstGeom>
+                  </pic:spPr>
+                </pic:pic>
+              </a:graphicData>
+            </a:graphic>
+          </wp:inline>
+        </w:drawing>
+      </w:r>
+    </w:p>
+    <w:p>
+      <w:r>
+        <w:t>Une fois le serveur lancé :</w:t>
+      </w:r>
+    </w:p>
+    <w:p>
+      <w:r>
+        <w:lastRenderedPageBreak/>
+        <w:drawing>
+          <wp:inline distT="0" distB="0" distL="0" distR="0" wp14:anchorId="593BD717" wp14:editId="67B77B46">
+            <wp:extent cx="4458086" cy="1882303"/>
+            <wp:effectExtent l="0" t="0" r="0" b="3810"/>
+            <wp:docPr id="1059631231" name="Image 1"/>
+            <wp:cNvGraphicFramePr>
+              <a:graphicFrameLocks xmlns:a="http://schemas.openxmlformats.org/drawingml/2006/main" noChangeAspect="1"/>
+            </wp:cNvGraphicFramePr>
+            <a:graphic xmlns:a="http://schemas.openxmlformats.org/drawingml/2006/main">
+              <a:graphicData uri="http://schemas.openxmlformats.org/drawingml/2006/picture">
+                <pic:pic xmlns:pic="http://schemas.openxmlformats.org/drawingml/2006/picture">
+                  <pic:nvPicPr>
+                    <pic:cNvPr id="1059631231" name=""/>
+                    <pic:cNvPicPr/>
+                  </pic:nvPicPr>
+                  <pic:blipFill>
+                    <a:blip r:embed="rId7"/>
+                    <a:stretch>
+                      <a:fillRect/>
+                    </a:stretch>
+                  </pic:blipFill>
+                  <pic:spPr>
+                    <a:xfrm>
+                      <a:off x="0" y="0"/>
+                      <a:ext cx="4458086" cy="1882303"/>
+                    </a:xfrm>
+                    <a:prstGeom prst="rect">
+                      <a:avLst/>
+                    </a:prstGeom>
+                  </pic:spPr>
+                </pic:pic>
+              </a:graphicData>
+            </a:graphic>
+          </wp:inline>
+        </w:drawing>
+      </w:r>
+    </w:p>
+    <w:p>
+      <w:r>
+        <w:drawing>
+          <wp:inline distT="0" distB="0" distL="0" distR="0" wp14:anchorId="64E2B30B" wp14:editId="3F99BC35">
+            <wp:extent cx="5760720" cy="2887980"/>
+            <wp:effectExtent l="0" t="0" r="0" b="7620"/>
+            <wp:docPr id="62189574" name="Image 1"/>
+            <wp:cNvGraphicFramePr>
+              <a:graphicFrameLocks xmlns:a="http://schemas.openxmlformats.org/drawingml/2006/main" noChangeAspect="1"/>
+            </wp:cNvGraphicFramePr>
+            <a:graphic xmlns:a="http://schemas.openxmlformats.org/drawingml/2006/main">
+              <a:graphicData uri="http://schemas.openxmlformats.org/drawingml/2006/picture">
+                <pic:pic xmlns:pic="http://schemas.openxmlformats.org/drawingml/2006/picture">
+                  <pic:nvPicPr>
+                    <pic:cNvPr id="62189574" name=""/>
+                    <pic:cNvPicPr/>
+                  </pic:nvPicPr>
+                  <pic:blipFill>
+                    <a:blip r:embed="rId8"/>
+                    <a:stretch>
+                      <a:fillRect/>
+                    </a:stretch>
+                  </pic:blipFill>
+                  <pic:spPr>
+                    <a:xfrm>
+                      <a:off x="0" y="0"/>
+                      <a:ext cx="5760720" cy="2887980"/>
+                    </a:xfrm>
+                    <a:prstGeom prst="rect">
+                      <a:avLst/>
+                    </a:prstGeom>
+                  </pic:spPr>
+                </pic:pic>
+              </a:graphicData>
+            </a:graphic>
+          </wp:inline>
+        </w:drawing>
       </w:r>
     </w:p>
     <w:p/>

</xml_diff>

<commit_message>
TP3: Ajoute la route GET /containers filtrée sur les conteneurs étiquetés
</commit_message>
<xml_diff>
--- a/TP3-api-rest.docx
+++ b/TP3-api-rest.docx
@@ -121,55 +121,13 @@
         <w:t xml:space="preserve">Dans le fichier main.py, </w:t>
       </w:r>
       <w:r>
-        <w:t xml:space="preserve">on créer la première route </w:t>
-      </w:r>
-      <w:proofErr w:type="spellStart"/>
-      <w:r>
-        <w:t>health</w:t>
-      </w:r>
-      <w:proofErr w:type="spellEnd"/>
-      <w:r>
-        <w:t xml:space="preserve"> afin d’initialiser </w:t>
-      </w:r>
-      <w:proofErr w:type="spellStart"/>
-      <w:r>
-        <w:t>FastAPI</w:t>
-      </w:r>
-      <w:proofErr w:type="spellEnd"/>
-      <w:r>
-        <w:t xml:space="preserve"> et créer la route.</w:t>
+        <w:t>on créer la première route health afin d’initialiser FastAPI et créer la route.</w:t>
       </w:r>
     </w:p>
     <w:p>
       <w:r>
-        <w:t>On lance par la suite le serveur de développement qui se recharge automatiquement (--</w:t>
-      </w:r>
-      <w:proofErr w:type="spellStart"/>
-      <w:r>
-        <w:t>reload</w:t>
-      </w:r>
-      <w:proofErr w:type="spellEnd"/>
-      <w:r>
-        <w:t xml:space="preserve">) et il </w:t>
-      </w:r>
-      <w:proofErr w:type="gramStart"/>
-      <w:r>
-        <w:t>prends</w:t>
-      </w:r>
-      <w:proofErr w:type="gramEnd"/>
-      <w:r>
-        <w:t xml:space="preserve"> en compte le fichier </w:t>
-      </w:r>
-      <w:proofErr w:type="gramStart"/>
-      <w:r>
-        <w:t>d’environnement .</w:t>
-      </w:r>
-      <w:proofErr w:type="spellStart"/>
-      <w:r>
-        <w:t>env</w:t>
-      </w:r>
-      <w:proofErr w:type="spellEnd"/>
-      <w:proofErr w:type="gramEnd"/>
+        <w:t>On lance par la suite le serveur de développement qui se recharge automatiquement (--reload) et il prends en compte le fichier d’environnement .env</w:t>
+      </w:r>
     </w:p>
     <w:p>
       <w:r>
@@ -294,7 +252,112 @@
         </w:drawing>
       </w:r>
     </w:p>
-    <w:p/>
+    <w:p>
+      <w:r>
+        <w:t>On va mettre en place </w:t>
+      </w:r>
+      <w:r>
+        <w:t>l'écriture de la route GET /containers pour lister uniquement les conteneurs étiquetés</w:t>
+      </w:r>
+      <w:r>
+        <w:t>.</w:t>
+      </w:r>
+    </w:p>
+    <w:p>
+      <w:r>
+        <w:t xml:space="preserve">Le vérificateur n'attend pas tous les conteneurs, mais seulement ceux qui possèdent une étiquette (un label) spécifique, par exemple pour éviter de récupérer des conteneurs </w:t>
+      </w:r>
+      <w:r>
+        <w:t>inutiles</w:t>
+      </w:r>
+      <w:r>
+        <w:t xml:space="preserve"> (comme le conteneur intrus vu au TP2). L'adresse de l'API Docker doit également être récupérée depuis la variable d'environnement DOCKER_API_URL.</w:t>
+      </w:r>
+    </w:p>
+    <w:p>
+      <w:r>
+        <w:t>On met à jour main.py puis on relance le serveur avec la commande précédente.</w:t>
+      </w:r>
+    </w:p>
+    <w:p>
+      <w:r>
+        <w:drawing>
+          <wp:inline distT="0" distB="0" distL="0" distR="0" wp14:anchorId="27051D6B" wp14:editId="27C393F6">
+            <wp:extent cx="5760720" cy="1894205"/>
+            <wp:effectExtent l="0" t="0" r="0" b="0"/>
+            <wp:docPr id="82858208" name="Image 1"/>
+            <wp:cNvGraphicFramePr>
+              <a:graphicFrameLocks xmlns:a="http://schemas.openxmlformats.org/drawingml/2006/main" noChangeAspect="1"/>
+            </wp:cNvGraphicFramePr>
+            <a:graphic xmlns:a="http://schemas.openxmlformats.org/drawingml/2006/main">
+              <a:graphicData uri="http://schemas.openxmlformats.org/drawingml/2006/picture">
+                <pic:pic xmlns:pic="http://schemas.openxmlformats.org/drawingml/2006/picture">
+                  <pic:nvPicPr>
+                    <pic:cNvPr id="82858208" name=""/>
+                    <pic:cNvPicPr/>
+                  </pic:nvPicPr>
+                  <pic:blipFill>
+                    <a:blip r:embed="rId9"/>
+                    <a:stretch>
+                      <a:fillRect/>
+                    </a:stretch>
+                  </pic:blipFill>
+                  <pic:spPr>
+                    <a:xfrm>
+                      <a:off x="0" y="0"/>
+                      <a:ext cx="5760720" cy="1894205"/>
+                    </a:xfrm>
+                    <a:prstGeom prst="rect">
+                      <a:avLst/>
+                    </a:prstGeom>
+                  </pic:spPr>
+                </pic:pic>
+              </a:graphicData>
+            </a:graphic>
+          </wp:inline>
+        </w:drawing>
+      </w:r>
+    </w:p>
+    <w:p>
+      <w:r>
+        <w:lastRenderedPageBreak/>
+        <w:drawing>
+          <wp:inline distT="0" distB="0" distL="0" distR="0" wp14:anchorId="6AC67E8A" wp14:editId="213B4228">
+            <wp:extent cx="5760720" cy="2733040"/>
+            <wp:effectExtent l="0" t="0" r="0" b="0"/>
+            <wp:docPr id="1645093103" name="Image 1"/>
+            <wp:cNvGraphicFramePr>
+              <a:graphicFrameLocks xmlns:a="http://schemas.openxmlformats.org/drawingml/2006/main" noChangeAspect="1"/>
+            </wp:cNvGraphicFramePr>
+            <a:graphic xmlns:a="http://schemas.openxmlformats.org/drawingml/2006/main">
+              <a:graphicData uri="http://schemas.openxmlformats.org/drawingml/2006/picture">
+                <pic:pic xmlns:pic="http://schemas.openxmlformats.org/drawingml/2006/picture">
+                  <pic:nvPicPr>
+                    <pic:cNvPr id="1645093103" name=""/>
+                    <pic:cNvPicPr/>
+                  </pic:nvPicPr>
+                  <pic:blipFill>
+                    <a:blip r:embed="rId10"/>
+                    <a:stretch>
+                      <a:fillRect/>
+                    </a:stretch>
+                  </pic:blipFill>
+                  <pic:spPr>
+                    <a:xfrm>
+                      <a:off x="0" y="0"/>
+                      <a:ext cx="5760720" cy="2733040"/>
+                    </a:xfrm>
+                    <a:prstGeom prst="rect">
+                      <a:avLst/>
+                    </a:prstGeom>
+                  </pic:spPr>
+                </pic:pic>
+              </a:graphicData>
+            </a:graphic>
+          </wp:inline>
+        </w:drawing>
+      </w:r>
+    </w:p>
     <w:sectPr>
       <w:pgSz w:w="11906" w:h="16838"/>
       <w:pgMar w:top="1417" w:right="1417" w:bottom="1417" w:left="1417" w:header="708" w:footer="708" w:gutter="0"/>
@@ -908,7 +971,6 @@
   <w:style w:type="character" w:default="1" w:styleId="Policepardfaut">
     <w:name w:val="Default Paragraph Font"/>
     <w:uiPriority w:val="1"/>
-    <w:semiHidden/>
     <w:unhideWhenUsed/>
   </w:style>
   <w:style w:type="table" w:default="1" w:styleId="TableauNormal">

</xml_diff>

<commit_message>
TP3: Ajoute la route GET /containers/{id} avec gestion des 404 (inconnu ou sans label)
</commit_message>
<xml_diff>
--- a/TP3-api-rest.docx
+++ b/TP3-api-rest.docx
@@ -346,6 +346,58 @@
                     <a:xfrm>
                       <a:off x="0" y="0"/>
                       <a:ext cx="5760720" cy="2733040"/>
+                    </a:xfrm>
+                    <a:prstGeom prst="rect">
+                      <a:avLst/>
+                    </a:prstGeom>
+                  </pic:spPr>
+                </pic:pic>
+              </a:graphicData>
+            </a:graphic>
+          </wp:inline>
+        </w:drawing>
+      </w:r>
+    </w:p>
+    <w:p>
+      <w:r>
+        <w:t xml:space="preserve">Ensuite nous allons rajouter </w:t>
+      </w:r>
+      <w:r>
+        <w:t>l'écriture de la route GET /containers/{id} pour récupérer le détail d'un conteneur spécifique.</w:t>
+      </w:r>
+    </w:p>
+    <w:p>
+      <w:r>
+        <w:t>On met à jour le code puis on relance le serveur.</w:t>
+      </w:r>
+    </w:p>
+    <w:p>
+      <w:r>
+        <w:drawing>
+          <wp:inline distT="0" distB="0" distL="0" distR="0" wp14:anchorId="7555F54D" wp14:editId="2C7B604C">
+            <wp:extent cx="5760720" cy="2987040"/>
+            <wp:effectExtent l="0" t="0" r="0" b="3810"/>
+            <wp:docPr id="903019649" name="Image 1"/>
+            <wp:cNvGraphicFramePr>
+              <a:graphicFrameLocks xmlns:a="http://schemas.openxmlformats.org/drawingml/2006/main" noChangeAspect="1"/>
+            </wp:cNvGraphicFramePr>
+            <a:graphic xmlns:a="http://schemas.openxmlformats.org/drawingml/2006/main">
+              <a:graphicData uri="http://schemas.openxmlformats.org/drawingml/2006/picture">
+                <pic:pic xmlns:pic="http://schemas.openxmlformats.org/drawingml/2006/picture">
+                  <pic:nvPicPr>
+                    <pic:cNvPr id="903019649" name=""/>
+                    <pic:cNvPicPr/>
+                  </pic:nvPicPr>
+                  <pic:blipFill>
+                    <a:blip r:embed="rId11"/>
+                    <a:stretch>
+                      <a:fillRect/>
+                    </a:stretch>
+                  </pic:blipFill>
+                  <pic:spPr>
+                    <a:xfrm>
+                      <a:off x="0" y="0"/>
+                      <a:ext cx="5760720" cy="2987040"/>
                     </a:xfrm>
                     <a:prstGeom prst="rect">
                       <a:avLst/>

</xml_diff>

<commit_message>
TP3: Conteneurise l'API FastAPI et valide toutes les étapes grâce au vérificateur
</commit_message>
<xml_diff>
--- a/TP3-api-rest.docx
+++ b/TP3-api-rest.docx
@@ -408,6 +408,207 @@
             </a:graphic>
           </wp:inline>
         </w:drawing>
+      </w:r>
+    </w:p>
+    <w:p>
+      <w:r>
+        <w:t xml:space="preserve">On s’assure que notre code </w:t>
+      </w:r>
+      <w:r>
+        <w:t>récupère bien l’adresse de l’API docker via la variable d’environnement du .env</w:t>
+      </w:r>
+    </w:p>
+    <w:p>
+      <w:r>
+        <w:t>DOCKER_API_URL = os.environ.get("DOCKER_API_URL", "http://127.0.0.1:2375")</w:t>
+      </w:r>
+      <w:r>
+        <w:br/>
+      </w:r>
+      <w:r>
+        <w:br/>
+      </w:r>
+      <w:r>
+        <w:t>On relance par la suite notre serveur pour vérifier avec le vérificateur que tout fonctionne.</w:t>
+      </w:r>
+    </w:p>
+    <w:p>
+      <w:r>
+        <w:lastRenderedPageBreak/>
+        <w:drawing>
+          <wp:inline distT="0" distB="0" distL="0" distR="0" wp14:anchorId="43E96AEC" wp14:editId="3122FDBC">
+            <wp:extent cx="5760720" cy="1764030"/>
+            <wp:effectExtent l="0" t="0" r="0" b="7620"/>
+            <wp:docPr id="1780776080" name="Image 1"/>
+            <wp:cNvGraphicFramePr>
+              <a:graphicFrameLocks xmlns:a="http://schemas.openxmlformats.org/drawingml/2006/main" noChangeAspect="1"/>
+            </wp:cNvGraphicFramePr>
+            <a:graphic xmlns:a="http://schemas.openxmlformats.org/drawingml/2006/main">
+              <a:graphicData uri="http://schemas.openxmlformats.org/drawingml/2006/picture">
+                <pic:pic xmlns:pic="http://schemas.openxmlformats.org/drawingml/2006/picture">
+                  <pic:nvPicPr>
+                    <pic:cNvPr id="1780776080" name=""/>
+                    <pic:cNvPicPr/>
+                  </pic:nvPicPr>
+                  <pic:blipFill>
+                    <a:blip r:embed="rId12"/>
+                    <a:stretch>
+                      <a:fillRect/>
+                    </a:stretch>
+                  </pic:blipFill>
+                  <pic:spPr>
+                    <a:xfrm>
+                      <a:off x="0" y="0"/>
+                      <a:ext cx="5760720" cy="1764030"/>
+                    </a:xfrm>
+                    <a:prstGeom prst="rect">
+                      <a:avLst/>
+                    </a:prstGeom>
+                  </pic:spPr>
+                </pic:pic>
+              </a:graphicData>
+            </a:graphic>
+          </wp:inline>
+        </w:drawing>
+      </w:r>
+    </w:p>
+    <w:p>
+      <w:r>
+        <w:t>A la racine du projet, on créer un Dockerfile </w:t>
+      </w:r>
+    </w:p>
+    <w:p>
+      <w:r>
+        <w:drawing>
+          <wp:inline distT="0" distB="0" distL="0" distR="0" wp14:anchorId="0BCFB72E" wp14:editId="3F046C2D">
+            <wp:extent cx="5760720" cy="3650615"/>
+            <wp:effectExtent l="0" t="0" r="0" b="6985"/>
+            <wp:docPr id="1068362405" name="Image 1"/>
+            <wp:cNvGraphicFramePr>
+              <a:graphicFrameLocks xmlns:a="http://schemas.openxmlformats.org/drawingml/2006/main" noChangeAspect="1"/>
+            </wp:cNvGraphicFramePr>
+            <a:graphic xmlns:a="http://schemas.openxmlformats.org/drawingml/2006/main">
+              <a:graphicData uri="http://schemas.openxmlformats.org/drawingml/2006/picture">
+                <pic:pic xmlns:pic="http://schemas.openxmlformats.org/drawingml/2006/picture">
+                  <pic:nvPicPr>
+                    <pic:cNvPr id="1068362405" name=""/>
+                    <pic:cNvPicPr/>
+                  </pic:nvPicPr>
+                  <pic:blipFill>
+                    <a:blip r:embed="rId13"/>
+                    <a:stretch>
+                      <a:fillRect/>
+                    </a:stretch>
+                  </pic:blipFill>
+                  <pic:spPr>
+                    <a:xfrm>
+                      <a:off x="0" y="0"/>
+                      <a:ext cx="5760720" cy="3650615"/>
+                    </a:xfrm>
+                    <a:prstGeom prst="rect">
+                      <a:avLst/>
+                    </a:prstGeom>
+                  </pic:spPr>
+                </pic:pic>
+              </a:graphicData>
+            </a:graphic>
+          </wp:inline>
+        </w:drawing>
+      </w:r>
+    </w:p>
+    <w:p>
+      <w:r>
+        <w:t xml:space="preserve">On décommente la partie API dans le docker compose : </w:t>
+      </w:r>
+    </w:p>
+    <w:p>
+      <w:r>
+        <w:drawing>
+          <wp:inline distT="0" distB="0" distL="0" distR="0" wp14:anchorId="59B4B2E5" wp14:editId="043FDB07">
+            <wp:extent cx="3749365" cy="2347163"/>
+            <wp:effectExtent l="0" t="0" r="3810" b="0"/>
+            <wp:docPr id="876907037" name="Image 1"/>
+            <wp:cNvGraphicFramePr>
+              <a:graphicFrameLocks xmlns:a="http://schemas.openxmlformats.org/drawingml/2006/main" noChangeAspect="1"/>
+            </wp:cNvGraphicFramePr>
+            <a:graphic xmlns:a="http://schemas.openxmlformats.org/drawingml/2006/main">
+              <a:graphicData uri="http://schemas.openxmlformats.org/drawingml/2006/picture">
+                <pic:pic xmlns:pic="http://schemas.openxmlformats.org/drawingml/2006/picture">
+                  <pic:nvPicPr>
+                    <pic:cNvPr id="876907037" name=""/>
+                    <pic:cNvPicPr/>
+                  </pic:nvPicPr>
+                  <pic:blipFill>
+                    <a:blip r:embed="rId14"/>
+                    <a:stretch>
+                      <a:fillRect/>
+                    </a:stretch>
+                  </pic:blipFill>
+                  <pic:spPr>
+                    <a:xfrm>
+                      <a:off x="0" y="0"/>
+                      <a:ext cx="3749365" cy="2347163"/>
+                    </a:xfrm>
+                    <a:prstGeom prst="rect">
+                      <a:avLst/>
+                    </a:prstGeom>
+                  </pic:spPr>
+                </pic:pic>
+              </a:graphicData>
+            </a:graphic>
+          </wp:inline>
+        </w:drawing>
+      </w:r>
+    </w:p>
+    <w:p>
+      <w:r>
+        <w:lastRenderedPageBreak/>
+        <w:t xml:space="preserve">On </w:t>
+      </w:r>
+      <w:r>
+        <w:t>exécute la commande de construction et de lancement de conteneur :</w:t>
+      </w:r>
+    </w:p>
+    <w:p>
+      <w:r>
+        <w:drawing>
+          <wp:inline distT="0" distB="0" distL="0" distR="0" wp14:anchorId="40DA8933" wp14:editId="43FD8169">
+            <wp:extent cx="5760720" cy="3373755"/>
+            <wp:effectExtent l="0" t="0" r="0" b="0"/>
+            <wp:docPr id="1660217756" name="Image 1"/>
+            <wp:cNvGraphicFramePr>
+              <a:graphicFrameLocks xmlns:a="http://schemas.openxmlformats.org/drawingml/2006/main" noChangeAspect="1"/>
+            </wp:cNvGraphicFramePr>
+            <a:graphic xmlns:a="http://schemas.openxmlformats.org/drawingml/2006/main">
+              <a:graphicData uri="http://schemas.openxmlformats.org/drawingml/2006/picture">
+                <pic:pic xmlns:pic="http://schemas.openxmlformats.org/drawingml/2006/picture">
+                  <pic:nvPicPr>
+                    <pic:cNvPr id="1660217756" name=""/>
+                    <pic:cNvPicPr/>
+                  </pic:nvPicPr>
+                  <pic:blipFill>
+                    <a:blip r:embed="rId15"/>
+                    <a:stretch>
+                      <a:fillRect/>
+                    </a:stretch>
+                  </pic:blipFill>
+                  <pic:spPr>
+                    <a:xfrm>
+                      <a:off x="0" y="0"/>
+                      <a:ext cx="5760720" cy="3373755"/>
+                    </a:xfrm>
+                    <a:prstGeom prst="rect">
+                      <a:avLst/>
+                    </a:prstGeom>
+                  </pic:spPr>
+                </pic:pic>
+              </a:graphicData>
+            </a:graphic>
+          </wp:inline>
+        </w:drawing>
+      </w:r>
+      <w:r>
+        <w:t>En relancant le vérificateur tout est toujours à 7/7</w:t>
       </w:r>
     </w:p>
     <w:sectPr>

</xml_diff>